<commit_message>
Justify body text in submit Word documents
</commit_message>
<xml_diff>
--- a/SUBMIT_AI_Assisted_Report.docx
+++ b/SUBMIT_AI_Assisted_Report.docx
@@ -53,6 +53,7 @@
     <w:p>
       <w:pPr>
         <w:pStyle w:val="Heading1"/>
+        <w:jc w:val="left"/>
       </w:pPr>
       <w:r>
         <w:rPr>
@@ -66,6 +67,9 @@
       </w:r>
     </w:p>
     <w:p>
+      <w:pPr>
+        <w:jc w:val="both"/>
+      </w:pPr>
       <w:r>
         <w:rPr>
           <w:rFonts w:ascii="Times New Roman" w:hAnsi="Times New Roman" w:eastAsia="Times New Roman"/>
@@ -78,6 +82,9 @@
       </w:r>
     </w:p>
     <w:p>
+      <w:pPr>
+        <w:jc w:val="both"/>
+      </w:pPr>
       <w:r>
         <w:rPr>
           <w:rFonts w:ascii="Times New Roman" w:hAnsi="Times New Roman" w:eastAsia="Times New Roman"/>
@@ -92,6 +99,7 @@
     <w:p>
       <w:pPr>
         <w:pStyle w:val="Heading1"/>
+        <w:jc w:val="left"/>
       </w:pPr>
       <w:r>
         <w:rPr>
@@ -107,6 +115,7 @@
     <w:p>
       <w:pPr>
         <w:pStyle w:val="ListBullet"/>
+        <w:jc w:val="left"/>
       </w:pPr>
       <w:r>
         <w:rPr>
@@ -122,6 +131,7 @@
     <w:p>
       <w:pPr>
         <w:pStyle w:val="ListBullet"/>
+        <w:jc w:val="left"/>
       </w:pPr>
       <w:r>
         <w:rPr>
@@ -137,6 +147,7 @@
     <w:p>
       <w:pPr>
         <w:pStyle w:val="ListBullet"/>
+        <w:jc w:val="left"/>
       </w:pPr>
       <w:r>
         <w:rPr>
@@ -152,6 +163,7 @@
     <w:p>
       <w:pPr>
         <w:pStyle w:val="ListBullet"/>
+        <w:jc w:val="left"/>
       </w:pPr>
       <w:r>
         <w:rPr>
@@ -167,6 +179,7 @@
     <w:p>
       <w:pPr>
         <w:pStyle w:val="ListBullet"/>
+        <w:jc w:val="left"/>
       </w:pPr>
       <w:r>
         <w:rPr>
@@ -182,6 +195,7 @@
     <w:p>
       <w:pPr>
         <w:pStyle w:val="ListBullet"/>
+        <w:jc w:val="left"/>
       </w:pPr>
       <w:r>
         <w:rPr>
@@ -197,6 +211,7 @@
     <w:p>
       <w:pPr>
         <w:pStyle w:val="ListBullet"/>
+        <w:jc w:val="left"/>
       </w:pPr>
       <w:r>
         <w:rPr>
@@ -212,6 +227,7 @@
     <w:p>
       <w:pPr>
         <w:pStyle w:val="Heading1"/>
+        <w:jc w:val="left"/>
       </w:pPr>
       <w:r>
         <w:rPr>
@@ -225,6 +241,9 @@
       </w:r>
     </w:p>
     <w:p>
+      <w:pPr>
+        <w:jc w:val="both"/>
+      </w:pPr>
       <w:r>
         <w:rPr>
           <w:rFonts w:ascii="Times New Roman" w:hAnsi="Times New Roman" w:eastAsia="Times New Roman"/>
@@ -247,6 +266,9 @@
       </w:r>
     </w:p>
     <w:p>
+      <w:pPr>
+        <w:jc w:val="both"/>
+      </w:pPr>
       <w:r>
         <w:rPr>
           <w:rFonts w:ascii="Times New Roman" w:hAnsi="Times New Roman" w:eastAsia="Times New Roman"/>
@@ -269,6 +291,9 @@
       </w:r>
     </w:p>
     <w:p>
+      <w:pPr>
+        <w:jc w:val="both"/>
+      </w:pPr>
       <w:r>
         <w:rPr>
           <w:rFonts w:ascii="Times New Roman" w:hAnsi="Times New Roman" w:eastAsia="Times New Roman"/>
@@ -291,6 +316,9 @@
       </w:r>
     </w:p>
     <w:p>
+      <w:pPr>
+        <w:jc w:val="both"/>
+      </w:pPr>
       <w:r>
         <w:rPr>
           <w:rFonts w:ascii="Times New Roman" w:hAnsi="Times New Roman" w:eastAsia="Times New Roman"/>
@@ -315,6 +343,7 @@
     <w:p>
       <w:pPr>
         <w:pStyle w:val="Heading1"/>
+        <w:jc w:val="left"/>
       </w:pPr>
       <w:r>
         <w:rPr>
@@ -328,6 +357,9 @@
       </w:r>
     </w:p>
     <w:p>
+      <w:pPr>
+        <w:jc w:val="both"/>
+      </w:pPr>
       <w:r>
         <w:rPr>
           <w:rFonts w:ascii="Times New Roman" w:hAnsi="Times New Roman" w:eastAsia="Times New Roman"/>
@@ -340,6 +372,9 @@
       </w:r>
     </w:p>
     <w:p>
+      <w:pPr>
+        <w:jc w:val="both"/>
+      </w:pPr>
       <w:r>
         <w:rPr>
           <w:rFonts w:ascii="Times New Roman" w:hAnsi="Times New Roman" w:eastAsia="Times New Roman"/>
@@ -354,6 +389,7 @@
     <w:p>
       <w:pPr>
         <w:pStyle w:val="Heading1"/>
+        <w:jc w:val="left"/>
       </w:pPr>
       <w:r>
         <w:rPr>
@@ -369,6 +405,7 @@
     <w:p>
       <w:pPr>
         <w:pStyle w:val="ListBullet"/>
+        <w:jc w:val="left"/>
       </w:pPr>
       <w:r>
         <w:rPr>
@@ -384,6 +421,7 @@
     <w:p>
       <w:pPr>
         <w:pStyle w:val="ListBullet"/>
+        <w:jc w:val="left"/>
       </w:pPr>
       <w:r>
         <w:rPr>
@@ -399,6 +437,7 @@
     <w:p>
       <w:pPr>
         <w:pStyle w:val="ListBullet"/>
+        <w:jc w:val="left"/>
       </w:pPr>
       <w:r>
         <w:rPr>
@@ -414,6 +453,7 @@
     <w:p>
       <w:pPr>
         <w:pStyle w:val="ListBullet"/>
+        <w:jc w:val="left"/>
       </w:pPr>
       <w:r>
         <w:rPr>
@@ -429,6 +469,7 @@
     <w:p>
       <w:pPr>
         <w:pStyle w:val="ListBullet"/>
+        <w:jc w:val="left"/>
       </w:pPr>
       <w:r>
         <w:rPr>
@@ -444,6 +485,7 @@
     <w:p>
       <w:pPr>
         <w:pStyle w:val="Heading1"/>
+        <w:jc w:val="left"/>
       </w:pPr>
       <w:r>
         <w:rPr>
@@ -459,6 +501,7 @@
     <w:p>
       <w:pPr>
         <w:pStyle w:val="ListBullet"/>
+        <w:jc w:val="left"/>
       </w:pPr>
       <w:r>
         <w:rPr>
@@ -474,6 +517,7 @@
     <w:p>
       <w:pPr>
         <w:pStyle w:val="ListBullet"/>
+        <w:jc w:val="left"/>
       </w:pPr>
       <w:r>
         <w:rPr>
@@ -489,6 +533,7 @@
     <w:p>
       <w:pPr>
         <w:pStyle w:val="ListBullet"/>
+        <w:jc w:val="left"/>
       </w:pPr>
       <w:r>
         <w:rPr>
@@ -504,6 +549,7 @@
     <w:p>
       <w:pPr>
         <w:pStyle w:val="ListBullet"/>
+        <w:jc w:val="left"/>
       </w:pPr>
       <w:r>
         <w:rPr>
@@ -519,6 +565,7 @@
     <w:p>
       <w:pPr>
         <w:pStyle w:val="ListBullet"/>
+        <w:jc w:val="left"/>
       </w:pPr>
       <w:r>
         <w:rPr>
@@ -534,6 +581,7 @@
     <w:p>
       <w:pPr>
         <w:pStyle w:val="Heading1"/>
+        <w:jc w:val="left"/>
       </w:pPr>
       <w:r>
         <w:rPr>
@@ -549,6 +597,7 @@
     <w:p>
       <w:pPr>
         <w:ind w:firstLine="360"/>
+        <w:jc w:val="both"/>
       </w:pPr>
       <w:r>
         <w:rPr>
@@ -575,6 +624,7 @@
     <w:p>
       <w:pPr>
         <w:pStyle w:val="Heading1"/>
+        <w:jc w:val="left"/>
       </w:pPr>
       <w:r>
         <w:rPr>
@@ -590,6 +640,7 @@
     <w:p>
       <w:pPr>
         <w:ind w:firstLine="360"/>
+        <w:jc w:val="both"/>
       </w:pPr>
       <w:r>
         <w:rPr>
@@ -616,6 +667,7 @@
     <w:p>
       <w:pPr>
         <w:pStyle w:val="Heading1"/>
+        <w:jc w:val="left"/>
       </w:pPr>
       <w:r>
         <w:rPr>
@@ -629,6 +681,9 @@
       </w:r>
     </w:p>
     <w:p>
+      <w:pPr>
+        <w:jc w:val="both"/>
+      </w:pPr>
       <w:r>
         <w:rPr>
           <w:rFonts w:ascii="Times New Roman" w:hAnsi="Times New Roman" w:eastAsia="Times New Roman"/>
@@ -1016,6 +1071,7 @@
     <w:pPr>
       <w:spacing w:after="120" w:line="276" w:lineRule="auto"/>
       <w:ind w:firstLine="360"/>
+      <w:jc w:val="both"/>
     </w:pPr>
     <w:rPr>
       <w:rFonts w:ascii="Times New Roman" w:hAnsi="Times New Roman" w:eastAsia="Times New Roman"/>

</xml_diff>

<commit_message>
Force justify alignment across submit Word documents
</commit_message>
<xml_diff>
--- a/SUBMIT_AI_Assisted_Report.docx
+++ b/SUBMIT_AI_Assisted_Report.docx
@@ -53,7 +53,7 @@
     <w:p>
       <w:pPr>
         <w:pStyle w:val="Heading1"/>
-        <w:jc w:val="left"/>
+        <w:jc w:val="both"/>
       </w:pPr>
       <w:r>
         <w:rPr>
@@ -99,7 +99,7 @@
     <w:p>
       <w:pPr>
         <w:pStyle w:val="Heading1"/>
-        <w:jc w:val="left"/>
+        <w:jc w:val="both"/>
       </w:pPr>
       <w:r>
         <w:rPr>
@@ -115,7 +115,7 @@
     <w:p>
       <w:pPr>
         <w:pStyle w:val="ListBullet"/>
-        <w:jc w:val="left"/>
+        <w:jc w:val="both"/>
       </w:pPr>
       <w:r>
         <w:rPr>
@@ -131,7 +131,7 @@
     <w:p>
       <w:pPr>
         <w:pStyle w:val="ListBullet"/>
-        <w:jc w:val="left"/>
+        <w:jc w:val="both"/>
       </w:pPr>
       <w:r>
         <w:rPr>
@@ -147,7 +147,7 @@
     <w:p>
       <w:pPr>
         <w:pStyle w:val="ListBullet"/>
-        <w:jc w:val="left"/>
+        <w:jc w:val="both"/>
       </w:pPr>
       <w:r>
         <w:rPr>
@@ -163,7 +163,7 @@
     <w:p>
       <w:pPr>
         <w:pStyle w:val="ListBullet"/>
-        <w:jc w:val="left"/>
+        <w:jc w:val="both"/>
       </w:pPr>
       <w:r>
         <w:rPr>
@@ -179,7 +179,7 @@
     <w:p>
       <w:pPr>
         <w:pStyle w:val="ListBullet"/>
-        <w:jc w:val="left"/>
+        <w:jc w:val="both"/>
       </w:pPr>
       <w:r>
         <w:rPr>
@@ -195,7 +195,7 @@
     <w:p>
       <w:pPr>
         <w:pStyle w:val="ListBullet"/>
-        <w:jc w:val="left"/>
+        <w:jc w:val="both"/>
       </w:pPr>
       <w:r>
         <w:rPr>
@@ -211,7 +211,7 @@
     <w:p>
       <w:pPr>
         <w:pStyle w:val="ListBullet"/>
-        <w:jc w:val="left"/>
+        <w:jc w:val="both"/>
       </w:pPr>
       <w:r>
         <w:rPr>
@@ -227,7 +227,7 @@
     <w:p>
       <w:pPr>
         <w:pStyle w:val="Heading1"/>
-        <w:jc w:val="left"/>
+        <w:jc w:val="both"/>
       </w:pPr>
       <w:r>
         <w:rPr>
@@ -343,7 +343,7 @@
     <w:p>
       <w:pPr>
         <w:pStyle w:val="Heading1"/>
-        <w:jc w:val="left"/>
+        <w:jc w:val="both"/>
       </w:pPr>
       <w:r>
         <w:rPr>
@@ -389,7 +389,7 @@
     <w:p>
       <w:pPr>
         <w:pStyle w:val="Heading1"/>
-        <w:jc w:val="left"/>
+        <w:jc w:val="both"/>
       </w:pPr>
       <w:r>
         <w:rPr>
@@ -405,7 +405,7 @@
     <w:p>
       <w:pPr>
         <w:pStyle w:val="ListBullet"/>
-        <w:jc w:val="left"/>
+        <w:jc w:val="both"/>
       </w:pPr>
       <w:r>
         <w:rPr>
@@ -421,7 +421,7 @@
     <w:p>
       <w:pPr>
         <w:pStyle w:val="ListBullet"/>
-        <w:jc w:val="left"/>
+        <w:jc w:val="both"/>
       </w:pPr>
       <w:r>
         <w:rPr>
@@ -437,7 +437,7 @@
     <w:p>
       <w:pPr>
         <w:pStyle w:val="ListBullet"/>
-        <w:jc w:val="left"/>
+        <w:jc w:val="both"/>
       </w:pPr>
       <w:r>
         <w:rPr>
@@ -453,7 +453,7 @@
     <w:p>
       <w:pPr>
         <w:pStyle w:val="ListBullet"/>
-        <w:jc w:val="left"/>
+        <w:jc w:val="both"/>
       </w:pPr>
       <w:r>
         <w:rPr>
@@ -469,7 +469,7 @@
     <w:p>
       <w:pPr>
         <w:pStyle w:val="ListBullet"/>
-        <w:jc w:val="left"/>
+        <w:jc w:val="both"/>
       </w:pPr>
       <w:r>
         <w:rPr>
@@ -485,7 +485,7 @@
     <w:p>
       <w:pPr>
         <w:pStyle w:val="Heading1"/>
-        <w:jc w:val="left"/>
+        <w:jc w:val="both"/>
       </w:pPr>
       <w:r>
         <w:rPr>
@@ -501,7 +501,7 @@
     <w:p>
       <w:pPr>
         <w:pStyle w:val="ListBullet"/>
-        <w:jc w:val="left"/>
+        <w:jc w:val="both"/>
       </w:pPr>
       <w:r>
         <w:rPr>
@@ -517,7 +517,7 @@
     <w:p>
       <w:pPr>
         <w:pStyle w:val="ListBullet"/>
-        <w:jc w:val="left"/>
+        <w:jc w:val="both"/>
       </w:pPr>
       <w:r>
         <w:rPr>
@@ -533,7 +533,7 @@
     <w:p>
       <w:pPr>
         <w:pStyle w:val="ListBullet"/>
-        <w:jc w:val="left"/>
+        <w:jc w:val="both"/>
       </w:pPr>
       <w:r>
         <w:rPr>
@@ -549,7 +549,7 @@
     <w:p>
       <w:pPr>
         <w:pStyle w:val="ListBullet"/>
-        <w:jc w:val="left"/>
+        <w:jc w:val="both"/>
       </w:pPr>
       <w:r>
         <w:rPr>
@@ -565,7 +565,7 @@
     <w:p>
       <w:pPr>
         <w:pStyle w:val="ListBullet"/>
-        <w:jc w:val="left"/>
+        <w:jc w:val="both"/>
       </w:pPr>
       <w:r>
         <w:rPr>
@@ -581,7 +581,7 @@
     <w:p>
       <w:pPr>
         <w:pStyle w:val="Heading1"/>
-        <w:jc w:val="left"/>
+        <w:jc w:val="both"/>
       </w:pPr>
       <w:r>
         <w:rPr>
@@ -624,7 +624,7 @@
     <w:p>
       <w:pPr>
         <w:pStyle w:val="Heading1"/>
-        <w:jc w:val="left"/>
+        <w:jc w:val="both"/>
       </w:pPr>
       <w:r>
         <w:rPr>
@@ -667,7 +667,7 @@
     <w:p>
       <w:pPr>
         <w:pStyle w:val="Heading1"/>
-        <w:jc w:val="left"/>
+        <w:jc w:val="both"/>
       </w:pPr>
       <w:r>
         <w:rPr>
@@ -1135,6 +1135,7 @@
       <w:keepNext/>
       <w:keepLines/>
       <w:spacing w:before="280" w:after="120" w:line="276" w:lineRule="auto"/>
+      <w:jc w:val="both"/>
       <w:outlineLvl w:val="0"/>
     </w:pPr>
     <w:rPr>
@@ -1159,6 +1160,7 @@
       <w:keepNext/>
       <w:keepLines/>
       <w:spacing w:before="160" w:after="80" w:line="276" w:lineRule="auto"/>
+      <w:jc w:val="both"/>
       <w:outlineLvl w:val="1"/>
     </w:pPr>
     <w:rPr>
@@ -1183,6 +1185,7 @@
       <w:keepNext/>
       <w:keepLines/>
       <w:spacing w:before="120" w:after="60" w:line="276" w:lineRule="auto"/>
+      <w:jc w:val="both"/>
       <w:outlineLvl w:val="2"/>
     </w:pPr>
     <w:rPr>
@@ -1608,6 +1611,7 @@
       </w:numPr>
       <w:spacing w:after="80" w:line="276" w:lineRule="auto"/>
       <w:contextualSpacing/>
+      <w:jc w:val="both"/>
     </w:pPr>
     <w:rPr>
       <w:rFonts w:ascii="Times New Roman" w:hAnsi="Times New Roman" w:eastAsia="Times New Roman"/>
@@ -1653,6 +1657,7 @@
       </w:numPr>
       <w:spacing w:after="80" w:line="276" w:lineRule="auto"/>
       <w:contextualSpacing/>
+      <w:jc w:val="both"/>
     </w:pPr>
     <w:rPr>
       <w:rFonts w:ascii="Times New Roman" w:hAnsi="Times New Roman" w:eastAsia="Times New Roman"/>

</xml_diff>